<commit_message>
Bộ mẫu hợp đồng: tên NVO «Tư vấn và Xây dựng» ở các chỗ in sẵn (NVO-DC-04, NVS-HĐ-05)
Anh Dũng chốt 21/10/2026. convert.py đổi «TƯ VẤN & XÂY DỰNG»; seed ngừng bản cũ, nạp bản mới.

Co-Authored-By: Claude Opus 5.5 <noreply@anthropic.com>
</commit_message>
<xml_diff>
--- a/db/seed-assets/contract-templates/NVO/NVO-DC-04_Hop_dong_nguyen_tac_nha_cung_cap.docx
+++ b/db/seed-assets/contract-templates/NVO/NVO-DC-04_Hop_dong_nguyen_tac_nha_cung_cap.docx
@@ -42,7 +42,7 @@
                 <w:sz w:val="24"/>
                 <w:szCs w:val="24"/>
               </w:rPr>
-              <w:t xml:space="preserve">CÔNG TY TNHH TƯ VẤN &amp; XÂY DỰNG NHÀ VIỆT ONE</w:t>
+              <w:t xml:space="preserve">CÔNG TY TNHH TƯ VẤN VÀ XÂY DỰNG NHÀ VIỆT ONE</w:t>
             </w:r>
           </w:p>
           <w:p>
@@ -3186,7 +3186,7 @@
           <w:sz w:val="26"/>
           <w:szCs w:val="26"/>
         </w:rPr>
-        <w:t xml:space="preserve">Bên mua: CÔNG TY TNHH TƯ VẤN &amp; XÂY DỰNG NHÀ VIỆT ONE. Người đặt hàng: ……………………… – ĐT: ………………</w:t>
+        <w:t xml:space="preserve">Bên mua: CÔNG TY TNHH TƯ VẤN VÀ XÂY DỰNG NHÀ VIỆT ONE. Người đặt hàng: ……………………… – ĐT: ………………</w:t>
       </w:r>
     </w:p>
     <w:p>

</xml_diff>